<commit_message>
Switch the AI provider to Anthropic; redline the handoff to match
The handoff now carries tracked changes (author Claude) in sections 12, 21,
25, 29, 30 and appendix B: Claude Haiku 4.5 / Sonnet 5.5 / Opus 5.5 replace the
GPT-6 tiers, with prices and illustrative costs recalculated, and attribution
guidance rewritten for Anthropic. STACK, ARCHITECTURE, DECISIONS and
.env.example follow.

Co-Authored-By: Claude Opus 5.5 <noreply@anthropic.com>
Claude-Session: https://claude.ai/code/session_01Hi7UKT2rS1fRXMAXK6G7xv
</commit_message>
<xml_diff>
--- a/docs/HANDOFF-2026-10-02.docx
+++ b/docs/HANDOFF-2026-10-02.docx
@@ -6161,15 +6161,28 @@
             <w:pPr>
               <w:spacing w:after="0"/>
             </w:pPr>
-            <w:r>
-              <w:rPr>
-                <w:rFonts w:ascii="Aptos" w:hAnsi="Aptos"/>
-                <w:b w:val="0"/>
-                <w:color w:val="101828"/>
-                <w:sz w:val="17"/>
-              </w:rPr>
-              <w:t>GPT-6 Luna</w:t>
-            </w:r>
+            <w:del w:id="9001" w:author="Claude" w:date="2026-10-02T00:00:00Z">
+              <w:r>
+                <w:rPr>
+                  <w:rFonts w:ascii="Aptos" w:hAnsi="Aptos"/>
+                  <w:b w:val="0"/>
+                  <w:color w:val="101828"/>
+                  <w:sz w:val="17"/>
+                </w:rPr>
+                <w:delText xml:space="preserve">GPT-6 Luna</w:delText>
+              </w:r>
+            </w:del>
+            <w:ins w:id="9002" w:author="Claude" w:date="2026-10-02T00:00:00Z">
+              <w:r>
+                <w:rPr>
+                  <w:rFonts w:ascii="Aptos" w:hAnsi="Aptos"/>
+                  <w:b w:val="0"/>
+                  <w:color w:val="101828"/>
+                  <w:sz w:val="17"/>
+                </w:rPr>
+                <w:t xml:space="preserve">Claude Haiku 4.5</w:t>
+              </w:r>
+            </w:ins>
           </w:p>
         </w:tc>
         <w:tc>
@@ -6187,15 +6200,28 @@
             <w:pPr>
               <w:spacing w:after="0"/>
             </w:pPr>
-            <w:r>
-              <w:rPr>
-                <w:rFonts w:ascii="Aptos" w:hAnsi="Aptos"/>
-                <w:b w:val="0"/>
-                <w:color w:val="101828"/>
-                <w:sz w:val="17"/>
-              </w:rPr>
-              <w:t>$0.10</w:t>
-            </w:r>
+            <w:del w:id="9003" w:author="Claude" w:date="2026-10-02T00:00:00Z">
+              <w:r>
+                <w:rPr>
+                  <w:rFonts w:ascii="Aptos" w:hAnsi="Aptos"/>
+                  <w:b w:val="0"/>
+                  <w:color w:val="101828"/>
+                  <w:sz w:val="17"/>
+                </w:rPr>
+                <w:delText xml:space="preserve">$0.10</w:delText>
+              </w:r>
+            </w:del>
+            <w:ins w:id="9004" w:author="Claude" w:date="2026-10-02T00:00:00Z">
+              <w:r>
+                <w:rPr>
+                  <w:rFonts w:ascii="Aptos" w:hAnsi="Aptos"/>
+                  <w:b w:val="0"/>
+                  <w:color w:val="101828"/>
+                  <w:sz w:val="17"/>
+                </w:rPr>
+                <w:t xml:space="preserve">$1.00</w:t>
+              </w:r>
+            </w:ins>
           </w:p>
         </w:tc>
         <w:tc>
@@ -6213,15 +6239,28 @@
             <w:pPr>
               <w:spacing w:after="0"/>
             </w:pPr>
-            <w:r>
-              <w:rPr>
-                <w:rFonts w:ascii="Aptos" w:hAnsi="Aptos"/>
-                <w:b w:val="0"/>
-                <w:color w:val="101828"/>
-                <w:sz w:val="17"/>
-              </w:rPr>
-              <w:t>$0.50</w:t>
-            </w:r>
+            <w:del w:id="9005" w:author="Claude" w:date="2026-10-02T00:00:00Z">
+              <w:r>
+                <w:rPr>
+                  <w:rFonts w:ascii="Aptos" w:hAnsi="Aptos"/>
+                  <w:b w:val="0"/>
+                  <w:color w:val="101828"/>
+                  <w:sz w:val="17"/>
+                </w:rPr>
+                <w:delText xml:space="preserve">$0.50</w:delText>
+              </w:r>
+            </w:del>
+            <w:ins w:id="9006" w:author="Claude" w:date="2026-10-02T00:00:00Z">
+              <w:r>
+                <w:rPr>
+                  <w:rFonts w:ascii="Aptos" w:hAnsi="Aptos"/>
+                  <w:b w:val="0"/>
+                  <w:color w:val="101828"/>
+                  <w:sz w:val="17"/>
+                </w:rPr>
+                <w:t xml:space="preserve">$5.00</w:t>
+              </w:r>
+            </w:ins>
           </w:p>
         </w:tc>
         <w:tc>
@@ -6267,15 +6306,28 @@
             <w:pPr>
               <w:spacing w:after="0"/>
             </w:pPr>
-            <w:r>
-              <w:rPr>
-                <w:rFonts w:ascii="Aptos" w:hAnsi="Aptos"/>
-                <w:b w:val="0"/>
-                <w:color w:val="101828"/>
-                <w:sz w:val="17"/>
-              </w:rPr>
-              <w:t>GPT-6 Sol</w:t>
-            </w:r>
+            <w:del w:id="9007" w:author="Claude" w:date="2026-10-02T00:00:00Z">
+              <w:r>
+                <w:rPr>
+                  <w:rFonts w:ascii="Aptos" w:hAnsi="Aptos"/>
+                  <w:b w:val="0"/>
+                  <w:color w:val="101828"/>
+                  <w:sz w:val="17"/>
+                </w:rPr>
+                <w:delText xml:space="preserve">GPT-6 Sol</w:delText>
+              </w:r>
+            </w:del>
+            <w:ins w:id="9008" w:author="Claude" w:date="2026-10-02T00:00:00Z">
+              <w:r>
+                <w:rPr>
+                  <w:rFonts w:ascii="Aptos" w:hAnsi="Aptos"/>
+                  <w:b w:val="0"/>
+                  <w:color w:val="101828"/>
+                  <w:sz w:val="17"/>
+                </w:rPr>
+                <w:t xml:space="preserve">Claude Sonnet 5.5</w:t>
+              </w:r>
+            </w:ins>
           </w:p>
         </w:tc>
         <w:tc>
@@ -6373,15 +6425,28 @@
             <w:pPr>
               <w:spacing w:after="0"/>
             </w:pPr>
-            <w:r>
-              <w:rPr>
-                <w:rFonts w:ascii="Aptos" w:hAnsi="Aptos"/>
-                <w:b w:val="0"/>
-                <w:color w:val="101828"/>
-                <w:sz w:val="17"/>
-              </w:rPr>
-              <w:t>GPT-6 Astra</w:t>
-            </w:r>
+            <w:del w:id="9009" w:author="Claude" w:date="2026-10-02T00:00:00Z">
+              <w:r>
+                <w:rPr>
+                  <w:rFonts w:ascii="Aptos" w:hAnsi="Aptos"/>
+                  <w:b w:val="0"/>
+                  <w:color w:val="101828"/>
+                  <w:sz w:val="17"/>
+                </w:rPr>
+                <w:delText xml:space="preserve">GPT-6 Astra</w:delText>
+              </w:r>
+            </w:del>
+            <w:ins w:id="9010" w:author="Claude" w:date="2026-10-02T00:00:00Z">
+              <w:r>
+                <w:rPr>
+                  <w:rFonts w:ascii="Aptos" w:hAnsi="Aptos"/>
+                  <w:b w:val="0"/>
+                  <w:color w:val="101828"/>
+                  <w:sz w:val="17"/>
+                </w:rPr>
+                <w:t xml:space="preserve">Claude Opus 5.5</w:t>
+              </w:r>
+            </w:ins>
           </w:p>
         </w:tc>
         <w:tc>
@@ -6399,15 +6464,28 @@
             <w:pPr>
               <w:spacing w:after="0"/>
             </w:pPr>
-            <w:r>
-              <w:rPr>
-                <w:rFonts w:ascii="Aptos" w:hAnsi="Aptos"/>
-                <w:b w:val="0"/>
-                <w:color w:val="101828"/>
-                <w:sz w:val="17"/>
-              </w:rPr>
-              <w:t>$10.00</w:t>
-            </w:r>
+            <w:del w:id="9011" w:author="Claude" w:date="2026-10-02T00:00:00Z">
+              <w:r>
+                <w:rPr>
+                  <w:rFonts w:ascii="Aptos" w:hAnsi="Aptos"/>
+                  <w:b w:val="0"/>
+                  <w:color w:val="101828"/>
+                  <w:sz w:val="17"/>
+                </w:rPr>
+                <w:delText xml:space="preserve">$10.00</w:delText>
+              </w:r>
+            </w:del>
+            <w:ins w:id="9012" w:author="Claude" w:date="2026-10-02T00:00:00Z">
+              <w:r>
+                <w:rPr>
+                  <w:rFonts w:ascii="Aptos" w:hAnsi="Aptos"/>
+                  <w:b w:val="0"/>
+                  <w:color w:val="101828"/>
+                  <w:sz w:val="17"/>
+                </w:rPr>
+                <w:t xml:space="preserve">$4.00</w:t>
+              </w:r>
+            </w:ins>
           </w:p>
         </w:tc>
         <w:tc>
@@ -6425,15 +6503,28 @@
             <w:pPr>
               <w:spacing w:after="0"/>
             </w:pPr>
-            <w:r>
-              <w:rPr>
-                <w:rFonts w:ascii="Aptos" w:hAnsi="Aptos"/>
-                <w:b w:val="0"/>
-                <w:color w:val="101828"/>
-                <w:sz w:val="17"/>
-              </w:rPr>
-              <w:t>$50.00</w:t>
-            </w:r>
+            <w:del w:id="9013" w:author="Claude" w:date="2026-10-02T00:00:00Z">
+              <w:r>
+                <w:rPr>
+                  <w:rFonts w:ascii="Aptos" w:hAnsi="Aptos"/>
+                  <w:b w:val="0"/>
+                  <w:color w:val="101828"/>
+                  <w:sz w:val="17"/>
+                </w:rPr>
+                <w:delText xml:space="preserve">$50.00</w:delText>
+              </w:r>
+            </w:del>
+            <w:ins w:id="9014" w:author="Claude" w:date="2026-10-02T00:00:00Z">
+              <w:r>
+                <w:rPr>
+                  <w:rFonts w:ascii="Aptos" w:hAnsi="Aptos"/>
+                  <w:b w:val="0"/>
+                  <w:color w:val="101828"/>
+                  <w:sz w:val="17"/>
+                </w:rPr>
+                <w:t xml:space="preserve">$20.00</w:t>
+              </w:r>
+            </w:ins>
           </w:p>
         </w:tc>
         <w:tc>
@@ -6474,8 +6565,56 @@
           <w:color w:val="101828"/>
           <w:sz w:val="19"/>
         </w:rPr>
-        <w:t>These figures are the current short-context Standard API rates used for planning in this handoff. Model pricing and availability should be configuration, not hard-coded product copy.</w:t>
+        <w:t xml:space="preserve">These figures are </w:t>
       </w:r>
+      <w:del w:id="9015" w:author="Claude" w:date="2026-10-02T00:00:00Z">
+        <w:r>
+          <w:rPr>
+            <w:rFonts w:ascii="Aptos" w:hAnsi="Aptos"/>
+            <w:color w:val="101828"/>
+            <w:sz w:val="19"/>
+          </w:rPr>
+          <w:delText xml:space="preserve">the current short-context Standard API rates</w:delText>
+        </w:r>
+      </w:del>
+      <w:ins w:id="9016" w:author="Claude" w:date="2026-10-02T00:00:00Z">
+        <w:r>
+          <w:rPr>
+            <w:rFonts w:ascii="Aptos" w:hAnsi="Aptos"/>
+            <w:color w:val="101828"/>
+            <w:sz w:val="19"/>
+          </w:rPr>
+          <w:t xml:space="preserve">Anthropic's Claude API list rates as of September 2026 (model IDs claude-haiku-4-5, claude-sonnet-5-5, claude-opus-5-5)</w:t>
+        </w:r>
+      </w:ins>
+      <w:r>
+        <w:rPr>
+          <w:rFonts w:ascii="Aptos" w:hAnsi="Aptos"/>
+          <w:color w:val="101828"/>
+          <w:sz w:val="19"/>
+        </w:rPr>
+        <w:t xml:space="preserve"> used for planning in this handoff. Model pricing and availability should be configuration, </w:t>
+      </w:r>
+      <w:del w:id="9017" w:author="Claude" w:date="2026-10-02T00:00:00Z">
+        <w:r>
+          <w:rPr>
+            <w:rFonts w:ascii="Aptos" w:hAnsi="Aptos"/>
+            <w:color w:val="101828"/>
+            <w:sz w:val="19"/>
+          </w:rPr>
+          <w:delText xml:space="preserve">not hard-coded product copy.</w:delText>
+        </w:r>
+      </w:del>
+      <w:ins w:id="9018" w:author="Claude" w:date="2026-10-02T00:00:00Z">
+        <w:r>
+          <w:rPr>
+            <w:rFonts w:ascii="Aptos" w:hAnsi="Aptos"/>
+            <w:color w:val="101828"/>
+            <w:sz w:val="19"/>
+          </w:rPr>
+          <w:t xml:space="preserve">not hard-coded product copy. The Phase 5 benchmark should also measure a single model at low effort against this three-tier cascade before committing to it.</w:t>
+        </w:r>
+      </w:ins>
     </w:p>
     <w:p>
       <w:pPr>
@@ -6565,13 +6704,35 @@
             <w:r>
               <w:br/>
             </w:r>
+            <w:del w:id="9019" w:author="Claude" w:date="2026-10-02T00:00:00Z">
+              <w:r>
+                <w:rPr>
+                  <w:rFonts w:ascii="Consolas" w:hAnsi="Consolas"/>
+                  <w:color w:val="F9FAFB"/>
+                  <w:sz w:val="17"/>
+                </w:rPr>
+                <w:delText xml:space="preserve">  -&gt; Luna</w:delText>
+              </w:r>
+            </w:del>
+            <w:ins w:id="9020" w:author="Claude" w:date="2026-10-02T00:00:00Z">
+              <w:r>
+                <w:rPr>
+                  <w:rFonts w:ascii="Consolas" w:hAnsi="Consolas"/>
+                  <w:color w:val="F9FAFB"/>
+                  <w:sz w:val="17"/>
+                </w:rPr>
+                <w:t xml:space="preserve">  -&gt; Haiku</w:t>
+              </w:r>
+            </w:ins>
+            <w:r>
+              <w:br/>
+            </w:r>
             <w:r>
               <w:rPr>
                 <w:rFonts w:ascii="Consolas" w:hAnsi="Consolas"/>
                 <w:color w:val="F9FAFB"/>
                 <w:sz w:val="17"/>
               </w:rPr>
-              <w:t xml:space="preserve">  -&gt; Luna</w:t>
             </w:r>
             <w:r>
               <w:br/>
@@ -6582,7 +6743,31 @@
                 <w:color w:val="F9FAFB"/>
                 <w:sz w:val="17"/>
               </w:rPr>
-            </w:r>
+              <w:t>SMALL RANKING / SIMPLE JUDGMENT</w:t>
+            </w:r>
+            <w:r>
+              <w:br/>
+            </w:r>
+            <w:del w:id="9021" w:author="Claude" w:date="2026-10-02T00:00:00Z">
+              <w:r>
+                <w:rPr>
+                  <w:rFonts w:ascii="Consolas" w:hAnsi="Consolas"/>
+                  <w:color w:val="F9FAFB"/>
+                  <w:sz w:val="17"/>
+                </w:rPr>
+                <w:delText xml:space="preserve">  -&gt; Luna</w:delText>
+              </w:r>
+            </w:del>
+            <w:ins w:id="9022" w:author="Claude" w:date="2026-10-02T00:00:00Z">
+              <w:r>
+                <w:rPr>
+                  <w:rFonts w:ascii="Consolas" w:hAnsi="Consolas"/>
+                  <w:color w:val="F9FAFB"/>
+                  <w:sz w:val="17"/>
+                </w:rPr>
+                <w:t xml:space="preserve">  -&gt; Haiku</w:t>
+              </w:r>
+            </w:ins>
             <w:r>
               <w:br/>
             </w:r>
@@ -6592,7 +6777,6 @@
                 <w:color w:val="F9FAFB"/>
                 <w:sz w:val="17"/>
               </w:rPr>
-              <w:t>SMALL RANKING / SIMPLE JUDGMENT</w:t>
             </w:r>
             <w:r>
               <w:br/>
@@ -6603,8 +6787,31 @@
                 <w:color w:val="F9FAFB"/>
                 <w:sz w:val="17"/>
               </w:rPr>
-              <w:t xml:space="preserve">  -&gt; Luna</w:t>
-            </w:r>
+              <w:t>MEANINGFUL ROSTER + INJURY + FREE-AGENT DECISION</w:t>
+            </w:r>
+            <w:r>
+              <w:br/>
+            </w:r>
+            <w:del w:id="9023" w:author="Claude" w:date="2026-10-02T00:00:00Z">
+              <w:r>
+                <w:rPr>
+                  <w:rFonts w:ascii="Consolas" w:hAnsi="Consolas"/>
+                  <w:color w:val="F9FAFB"/>
+                  <w:sz w:val="17"/>
+                </w:rPr>
+                <w:delText xml:space="preserve">  -&gt; Sol</w:delText>
+              </w:r>
+            </w:del>
+            <w:ins w:id="9024" w:author="Claude" w:date="2026-10-02T00:00:00Z">
+              <w:r>
+                <w:rPr>
+                  <w:rFonts w:ascii="Consolas" w:hAnsi="Consolas"/>
+                  <w:color w:val="F9FAFB"/>
+                  <w:sz w:val="17"/>
+                </w:rPr>
+                <w:t xml:space="preserve">  -&gt; Sonnet</w:t>
+              </w:r>
+            </w:ins>
             <w:r>
               <w:br/>
             </w:r>
@@ -6624,50 +6831,38 @@
                 <w:color w:val="F9FAFB"/>
                 <w:sz w:val="17"/>
               </w:rPr>
-              <w:t>MEANINGFUL ROSTER + INJURY + FREE-AGENT DECISION</w:t>
+              <w:t>LOW-CONFIDENCE / EXCEPTIONAL CASE</w:t>
             </w:r>
             <w:r>
               <w:br/>
             </w:r>
+            <w:del w:id="9025" w:author="Claude" w:date="2026-10-02T00:00:00Z">
+              <w:r>
+                <w:rPr>
+                  <w:rFonts w:ascii="Consolas" w:hAnsi="Consolas"/>
+                  <w:color w:val="F9FAFB"/>
+                  <w:sz w:val="17"/>
+                </w:rPr>
+                <w:delText xml:space="preserve">  -&gt; Astra rarely</w:delText>
+              </w:r>
+            </w:del>
+            <w:ins w:id="9026" w:author="Claude" w:date="2026-10-02T00:00:00Z">
+              <w:r>
+                <w:rPr>
+                  <w:rFonts w:ascii="Consolas" w:hAnsi="Consolas"/>
+                  <w:color w:val="F9FAFB"/>
+                  <w:sz w:val="17"/>
+                </w:rPr>
+                <w:t xml:space="preserve">  -&gt; Opus rarely</w:t>
+              </w:r>
+            </w:ins>
             <w:r>
               <w:rPr>
                 <w:rFonts w:ascii="Consolas" w:hAnsi="Consolas"/>
                 <w:color w:val="F9FAFB"/>
                 <w:sz w:val="17"/>
               </w:rPr>
-              <w:t xml:space="preserve">  -&gt; Sol</w:t>
-            </w:r>
-            <w:r>
-              <w:br/>
-            </w:r>
-            <w:r>
-              <w:rPr>
-                <w:rFonts w:ascii="Consolas" w:hAnsi="Consolas"/>
-                <w:color w:val="F9FAFB"/>
-                <w:sz w:val="17"/>
-              </w:rPr>
-            </w:r>
-            <w:r>
-              <w:br/>
-            </w:r>
-            <w:r>
-              <w:rPr>
-                <w:rFonts w:ascii="Consolas" w:hAnsi="Consolas"/>
-                <w:color w:val="F9FAFB"/>
-                <w:sz w:val="17"/>
-              </w:rPr>
-              <w:t>LOW-CONFIDENCE / EXCEPTIONAL CASE</w:t>
-            </w:r>
-            <w:r>
-              <w:br/>
-            </w:r>
-            <w:r>
-              <w:rPr>
-                <w:rFonts w:ascii="Consolas" w:hAnsi="Consolas"/>
-                <w:color w:val="F9FAFB"/>
-                <w:sz w:val="17"/>
-              </w:rPr>
-              <w:t xml:space="preserve">  -&gt; Astra rarely, or require user review</w:t>
+              <w:t xml:space="preserve">, or require user review</w:t>
             </w:r>
           </w:p>
         </w:tc>
@@ -6860,15 +7055,28 @@
             <w:pPr>
               <w:spacing w:after="0"/>
             </w:pPr>
-            <w:r>
-              <w:rPr>
-                <w:rFonts w:ascii="Aptos" w:hAnsi="Aptos"/>
-                <w:b w:val="0"/>
-                <w:color w:val="101828"/>
-                <w:sz w:val="17"/>
-              </w:rPr>
-              <w:t>Luna</w:t>
-            </w:r>
+            <w:del w:id="9027" w:author="Claude" w:date="2026-10-02T00:00:00Z">
+              <w:r>
+                <w:rPr>
+                  <w:rFonts w:ascii="Aptos" w:hAnsi="Aptos"/>
+                  <w:b w:val="0"/>
+                  <w:color w:val="101828"/>
+                  <w:sz w:val="17"/>
+                </w:rPr>
+                <w:delText xml:space="preserve">Luna</w:delText>
+              </w:r>
+            </w:del>
+            <w:ins w:id="9028" w:author="Claude" w:date="2026-10-02T00:00:00Z">
+              <w:r>
+                <w:rPr>
+                  <w:rFonts w:ascii="Aptos" w:hAnsi="Aptos"/>
+                  <w:b w:val="0"/>
+                  <w:color w:val="101828"/>
+                  <w:sz w:val="17"/>
+                </w:rPr>
+                <w:t xml:space="preserve">Haiku 4.5</w:t>
+              </w:r>
+            </w:ins>
           </w:p>
         </w:tc>
         <w:tc>
@@ -6912,15 +7120,28 @@
             <w:pPr>
               <w:spacing w:after="0"/>
             </w:pPr>
-            <w:r>
-              <w:rPr>
-                <w:rFonts w:ascii="Aptos" w:hAnsi="Aptos"/>
-                <w:b w:val="0"/>
-                <w:color w:val="101828"/>
-                <w:sz w:val="17"/>
-              </w:rPr>
-              <w:t>$0.00015</w:t>
-            </w:r>
+            <w:del w:id="9031" w:author="Claude" w:date="2026-10-02T00:00:00Z">
+              <w:r>
+                <w:rPr>
+                  <w:rFonts w:ascii="Aptos" w:hAnsi="Aptos"/>
+                  <w:b w:val="0"/>
+                  <w:color w:val="101828"/>
+                  <w:sz w:val="17"/>
+                </w:rPr>
+                <w:delText xml:space="preserve">$0.00015</w:delText>
+              </w:r>
+            </w:del>
+            <w:ins w:id="9032" w:author="Claude" w:date="2026-10-02T00:00:00Z">
+              <w:r>
+                <w:rPr>
+                  <w:rFonts w:ascii="Aptos" w:hAnsi="Aptos"/>
+                  <w:b w:val="0"/>
+                  <w:color w:val="101828"/>
+                  <w:sz w:val="17"/>
+                </w:rPr>
+                <w:t xml:space="preserve">$0.0015</w:t>
+              </w:r>
+            </w:ins>
           </w:p>
         </w:tc>
       </w:tr>
@@ -6966,15 +7187,28 @@
             <w:pPr>
               <w:spacing w:after="0"/>
             </w:pPr>
-            <w:r>
-              <w:rPr>
-                <w:rFonts w:ascii="Aptos" w:hAnsi="Aptos"/>
-                <w:b w:val="0"/>
-                <w:color w:val="101828"/>
-                <w:sz w:val="17"/>
-              </w:rPr>
-              <w:t>Luna</w:t>
-            </w:r>
+            <w:del w:id="9029" w:author="Claude" w:date="2026-10-02T00:00:00Z">
+              <w:r>
+                <w:rPr>
+                  <w:rFonts w:ascii="Aptos" w:hAnsi="Aptos"/>
+                  <w:b w:val="0"/>
+                  <w:color w:val="101828"/>
+                  <w:sz w:val="17"/>
+                </w:rPr>
+                <w:delText xml:space="preserve">Luna</w:delText>
+              </w:r>
+            </w:del>
+            <w:ins w:id="9030" w:author="Claude" w:date="2026-10-02T00:00:00Z">
+              <w:r>
+                <w:rPr>
+                  <w:rFonts w:ascii="Aptos" w:hAnsi="Aptos"/>
+                  <w:b w:val="0"/>
+                  <w:color w:val="101828"/>
+                  <w:sz w:val="17"/>
+                </w:rPr>
+                <w:t xml:space="preserve">Haiku 4.5</w:t>
+              </w:r>
+            </w:ins>
           </w:p>
         </w:tc>
         <w:tc>
@@ -7018,15 +7252,28 @@
             <w:pPr>
               <w:spacing w:after="0"/>
             </w:pPr>
-            <w:r>
-              <w:rPr>
-                <w:rFonts w:ascii="Aptos" w:hAnsi="Aptos"/>
-                <w:b w:val="0"/>
-                <w:color w:val="101828"/>
-                <w:sz w:val="17"/>
-              </w:rPr>
-              <w:t>$0.00030</w:t>
-            </w:r>
+            <w:del w:id="9033" w:author="Claude" w:date="2026-10-02T00:00:00Z">
+              <w:r>
+                <w:rPr>
+                  <w:rFonts w:ascii="Aptos" w:hAnsi="Aptos"/>
+                  <w:b w:val="0"/>
+                  <w:color w:val="101828"/>
+                  <w:sz w:val="17"/>
+                </w:rPr>
+                <w:delText xml:space="preserve">$0.00030</w:delText>
+              </w:r>
+            </w:del>
+            <w:ins w:id="9034" w:author="Claude" w:date="2026-10-02T00:00:00Z">
+              <w:r>
+                <w:rPr>
+                  <w:rFonts w:ascii="Aptos" w:hAnsi="Aptos"/>
+                  <w:b w:val="0"/>
+                  <w:color w:val="101828"/>
+                  <w:sz w:val="17"/>
+                </w:rPr>
+                <w:t xml:space="preserve">$0.0030</w:t>
+              </w:r>
+            </w:ins>
           </w:p>
         </w:tc>
       </w:tr>
@@ -7072,15 +7319,28 @@
             <w:pPr>
               <w:spacing w:after="0"/>
             </w:pPr>
-            <w:r>
-              <w:rPr>
-                <w:rFonts w:ascii="Aptos" w:hAnsi="Aptos"/>
-                <w:b w:val="0"/>
-                <w:color w:val="101828"/>
-                <w:sz w:val="17"/>
-              </w:rPr>
-              <w:t>Sol</w:t>
-            </w:r>
+            <w:del w:id="9035" w:author="Claude" w:date="2026-10-02T00:00:00Z">
+              <w:r>
+                <w:rPr>
+                  <w:rFonts w:ascii="Aptos" w:hAnsi="Aptos"/>
+                  <w:b w:val="0"/>
+                  <w:color w:val="101828"/>
+                  <w:sz w:val="17"/>
+                </w:rPr>
+                <w:delText xml:space="preserve">Sol</w:delText>
+              </w:r>
+            </w:del>
+            <w:ins w:id="9036" w:author="Claude" w:date="2026-10-02T00:00:00Z">
+              <w:r>
+                <w:rPr>
+                  <w:rFonts w:ascii="Aptos" w:hAnsi="Aptos"/>
+                  <w:b w:val="0"/>
+                  <w:color w:val="101828"/>
+                  <w:sz w:val="17"/>
+                </w:rPr>
+                <w:t xml:space="preserve">Sonnet 5.5</w:t>
+              </w:r>
+            </w:ins>
           </w:p>
         </w:tc>
         <w:tc>
@@ -7178,15 +7438,28 @@
             <w:pPr>
               <w:spacing w:after="0"/>
             </w:pPr>
-            <w:r>
-              <w:rPr>
-                <w:rFonts w:ascii="Aptos" w:hAnsi="Aptos"/>
-                <w:b w:val="0"/>
-                <w:color w:val="101828"/>
-                <w:sz w:val="17"/>
-              </w:rPr>
-              <w:t>Sol</w:t>
-            </w:r>
+            <w:del w:id="9037" w:author="Claude" w:date="2026-10-02T00:00:00Z">
+              <w:r>
+                <w:rPr>
+                  <w:rFonts w:ascii="Aptos" w:hAnsi="Aptos"/>
+                  <w:b w:val="0"/>
+                  <w:color w:val="101828"/>
+                  <w:sz w:val="17"/>
+                </w:rPr>
+                <w:delText xml:space="preserve">Sol</w:delText>
+              </w:r>
+            </w:del>
+            <w:ins w:id="9038" w:author="Claude" w:date="2026-10-02T00:00:00Z">
+              <w:r>
+                <w:rPr>
+                  <w:rFonts w:ascii="Aptos" w:hAnsi="Aptos"/>
+                  <w:b w:val="0"/>
+                  <w:color w:val="101828"/>
+                  <w:sz w:val="17"/>
+                </w:rPr>
+                <w:t xml:space="preserve">Sonnet 5.5</w:t>
+              </w:r>
+            </w:ins>
           </w:p>
         </w:tc>
         <w:tc>
@@ -7284,15 +7557,28 @@
             <w:pPr>
               <w:spacing w:after="0"/>
             </w:pPr>
-            <w:r>
-              <w:rPr>
-                <w:rFonts w:ascii="Aptos" w:hAnsi="Aptos"/>
-                <w:b w:val="0"/>
-                <w:color w:val="101828"/>
-                <w:sz w:val="17"/>
-              </w:rPr>
-              <w:t>Astra</w:t>
-            </w:r>
+            <w:del w:id="9039" w:author="Claude" w:date="2026-10-02T00:00:00Z">
+              <w:r>
+                <w:rPr>
+                  <w:rFonts w:ascii="Aptos" w:hAnsi="Aptos"/>
+                  <w:b w:val="0"/>
+                  <w:color w:val="101828"/>
+                  <w:sz w:val="17"/>
+                </w:rPr>
+                <w:delText xml:space="preserve">Astra</w:delText>
+              </w:r>
+            </w:del>
+            <w:ins w:id="9040" w:author="Claude" w:date="2026-10-02T00:00:00Z">
+              <w:r>
+                <w:rPr>
+                  <w:rFonts w:ascii="Aptos" w:hAnsi="Aptos"/>
+                  <w:b w:val="0"/>
+                  <w:color w:val="101828"/>
+                  <w:sz w:val="17"/>
+                </w:rPr>
+                <w:t xml:space="preserve">Opus 5.5</w:t>
+              </w:r>
+            </w:ins>
           </w:p>
         </w:tc>
         <w:tc>
@@ -7336,15 +7622,28 @@
             <w:pPr>
               <w:spacing w:after="0"/>
             </w:pPr>
-            <w:r>
-              <w:rPr>
-                <w:rFonts w:ascii="Aptos" w:hAnsi="Aptos"/>
-                <w:b w:val="0"/>
-                <w:color w:val="101828"/>
-                <w:sz w:val="17"/>
-              </w:rPr>
-              <w:t>$0.17</w:t>
-            </w:r>
+            <w:del w:id="9041" w:author="Claude" w:date="2026-10-02T00:00:00Z">
+              <w:r>
+                <w:rPr>
+                  <w:rFonts w:ascii="Aptos" w:hAnsi="Aptos"/>
+                  <w:b w:val="0"/>
+                  <w:color w:val="101828"/>
+                  <w:sz w:val="17"/>
+                </w:rPr>
+                <w:delText xml:space="preserve">$0.17</w:delText>
+              </w:r>
+            </w:del>
+            <w:ins w:id="9042" w:author="Claude" w:date="2026-10-02T00:00:00Z">
+              <w:r>
+                <w:rPr>
+                  <w:rFonts w:ascii="Aptos" w:hAnsi="Aptos"/>
+                  <w:b w:val="0"/>
+                  <w:color w:val="101828"/>
+                  <w:sz w:val="17"/>
+                </w:rPr>
+                <w:t xml:space="preserve">$0.068</w:t>
+              </w:r>
+            </w:ins>
           </w:p>
         </w:tc>
       </w:tr>
@@ -7353,13 +7652,33 @@
       <w:pPr>
         <w:spacing w:after="100" w:line="254" w:lineRule="auto"/>
       </w:pPr>
+      <w:del w:id="9043" w:author="Claude" w:date="2026-10-02T00:00:00Z">
+        <w:r>
+          <w:rPr>
+            <w:rFonts w:ascii="Aptos" w:hAnsi="Aptos"/>
+            <w:color w:val="101828"/>
+            <w:sz w:val="19"/>
+          </w:rPr>
+          <w:delText xml:space="preserve">Reasoning tokens count toward output usage.</w:delText>
+        </w:r>
+      </w:del>
+      <w:ins w:id="9044" w:author="Claude" w:date="2026-10-02T00:00:00Z">
+        <w:r>
+          <w:rPr>
+            <w:rFonts w:ascii="Aptos" w:hAnsi="Aptos"/>
+            <w:color w:val="101828"/>
+            <w:sz w:val="19"/>
+          </w:rPr>
+          <w:t xml:space="preserve">Thinking tokens are billed as output tokens, so set the effort level explicitly for each route (low for classification).</w:t>
+        </w:r>
+      </w:ins>
       <w:r>
         <w:rPr>
           <w:rFonts w:ascii="Aptos" w:hAnsi="Aptos"/>
           <w:color w:val="101828"/>
           <w:sz w:val="19"/>
         </w:rPr>
-        <w:t>Reasoning tokens count toward output usage. Actual production cost must be measured from API usage, not inferred from perceived “thinking time.”</w:t>
+        <w:t xml:space="preserve"> Actual production cost must be measured from API usage, not inferred from perceived “thinking time.”</w:t>
       </w:r>
     </w:p>
     <w:p>
@@ -11566,15 +11885,28 @@
             <w:pPr>
               <w:spacing w:after="0"/>
             </w:pPr>
-            <w:r>
-              <w:rPr>
-                <w:rFonts w:ascii="Aptos" w:hAnsi="Aptos"/>
-                <w:b w:val="0"/>
-                <w:color w:val="101828"/>
-                <w:sz w:val="17"/>
-              </w:rPr>
-              <w:t>OpenAI Responses API with structured outputs</w:t>
-            </w:r>
+            <w:del w:id="9045" w:author="Claude" w:date="2026-10-02T00:00:00Z">
+              <w:r>
+                <w:rPr>
+                  <w:rFonts w:ascii="Aptos" w:hAnsi="Aptos"/>
+                  <w:b w:val="0"/>
+                  <w:color w:val="101828"/>
+                  <w:sz w:val="17"/>
+                </w:rPr>
+                <w:delText xml:space="preserve">OpenAI Responses API with structured outputs</w:delText>
+              </w:r>
+            </w:del>
+            <w:ins w:id="9046" w:author="Claude" w:date="2026-10-02T00:00:00Z">
+              <w:r>
+                <w:rPr>
+                  <w:rFonts w:ascii="Aptos" w:hAnsi="Aptos"/>
+                  <w:b w:val="0"/>
+                  <w:color w:val="101828"/>
+                  <w:sz w:val="17"/>
+                </w:rPr>
+                <w:t xml:space="preserve">Anthropic Claude API (Messages API) with structured outputs</w:t>
+              </w:r>
+            </w:ins>
           </w:p>
         </w:tc>
       </w:tr>
@@ -13154,6 +13486,28 @@
       <w:pPr>
         <w:spacing w:before="240" w:after="100"/>
       </w:pPr>
+      <w:del w:id="9047" w:author="Claude" w:date="2026-10-02T00:00:00Z">
+        <w:r>
+          <w:rPr>
+            <w:rFonts w:ascii="Aptos" w:hAnsi="Aptos"/>
+            <w:b/>
+            <w:color w:val="070A24"/>
+            <w:sz w:val="34"/>
+          </w:rPr>
+          <w:delText xml:space="preserve">25. OpenAI model attribution</w:delText>
+        </w:r>
+      </w:del>
+      <w:ins w:id="9048" w:author="Claude" w:date="2026-10-02T00:00:00Z">
+        <w:r>
+          <w:rPr>
+            <w:rFonts w:ascii="Aptos" w:hAnsi="Aptos"/>
+            <w:b/>
+            <w:color w:val="070A24"/>
+            <w:sz w:val="34"/>
+          </w:rPr>
+          <w:t xml:space="preserve">25. Anthropic model attribution</w:t>
+        </w:r>
+      </w:ins>
       <w:r>
         <w:rPr>
           <w:rFonts w:ascii="Aptos" w:hAnsi="Aptos"/>
@@ -13161,7 +13515,7 @@
           <w:color w:val="070A24"/>
           <w:sz w:val="34"/>
         </w:rPr>
-        <w:t>25. OpenAI model attribution and product branding</w:t>
+        <w:t xml:space="preserve"> and product branding</w:t>
       </w:r>
     </w:p>
     <w:tbl>
@@ -13204,13 +13558,117 @@
       <w:pPr>
         <w:spacing w:after="100" w:line="254" w:lineRule="auto"/>
       </w:pPr>
+      <w:del w:id="9049" w:author="Claude" w:date="2026-10-02T00:00:00Z">
+        <w:r>
+          <w:rPr>
+            <w:rFonts w:ascii="Aptos" w:hAnsi="Aptos"/>
+            <w:color w:val="101828"/>
+            <w:sz w:val="19"/>
+          </w:rPr>
+          <w:delText xml:space="preserve">OpenAI attribution</w:delText>
+        </w:r>
+      </w:del>
+      <w:ins w:id="9050" w:author="Claude" w:date="2026-10-02T00:00:00Z">
+        <w:r>
+          <w:rPr>
+            <w:rFonts w:ascii="Aptos" w:hAnsi="Aptos"/>
+            <w:color w:val="101828"/>
+            <w:sz w:val="19"/>
+          </w:rPr>
+          <w:t xml:space="preserve">Anthropic attribution</w:t>
+        </w:r>
+      </w:ins>
       <w:r>
         <w:rPr>
           <w:rFonts w:ascii="Aptos" w:hAnsi="Aptos"/>
           <w:color w:val="101828"/>
           <w:sz w:val="19"/>
         </w:rPr>
-        <w:t>OpenAI attribution is optional for an API-powered app. The app does not need a “Powered by OpenAI” badge to use the API. If the product chooses to credit the underlying model provider, keep HangoverBot/TurboLabs clearly primary, be precise about what is powered by OpenAI, and avoid implying that OpenAI created or endorses the app.</w:t>
+        <w:t xml:space="preserve"> is optional for an API-powered app. The app does not need a “</w:t>
+      </w:r>
+      <w:del w:id="9051" w:author="Claude" w:date="2026-10-02T00:00:00Z">
+        <w:r>
+          <w:rPr>
+            <w:rFonts w:ascii="Aptos" w:hAnsi="Aptos"/>
+            <w:color w:val="101828"/>
+            <w:sz w:val="19"/>
+          </w:rPr>
+          <w:delText xml:space="preserve">Powered by OpenAI</w:delText>
+        </w:r>
+      </w:del>
+      <w:ins w:id="9052" w:author="Claude" w:date="2026-10-02T00:00:00Z">
+        <w:r>
+          <w:rPr>
+            <w:rFonts w:ascii="Aptos" w:hAnsi="Aptos"/>
+            <w:color w:val="101828"/>
+            <w:sz w:val="19"/>
+          </w:rPr>
+          <w:t xml:space="preserve">Powered by Claude</w:t>
+        </w:r>
+      </w:ins>
+      <w:r>
+        <w:rPr>
+          <w:rFonts w:ascii="Aptos" w:hAnsi="Aptos"/>
+          <w:color w:val="101828"/>
+          <w:sz w:val="19"/>
+        </w:rPr>
+        <w:t xml:space="preserve">” badge to use the API. If the product chooses to credit the underlying model provider, keep HangoverBot/TurboLabs clearly primary, be precise about what is </w:t>
+      </w:r>
+      <w:del w:id="9053" w:author="Claude" w:date="2026-10-02T00:00:00Z">
+        <w:r>
+          <w:rPr>
+            <w:rFonts w:ascii="Aptos" w:hAnsi="Aptos"/>
+            <w:color w:val="101828"/>
+            <w:sz w:val="19"/>
+          </w:rPr>
+          <w:delText xml:space="preserve">powered by OpenAI</w:delText>
+        </w:r>
+      </w:del>
+      <w:ins w:id="9054" w:author="Claude" w:date="2026-10-02T00:00:00Z">
+        <w:r>
+          <w:rPr>
+            <w:rFonts w:ascii="Aptos" w:hAnsi="Aptos"/>
+            <w:color w:val="101828"/>
+            <w:sz w:val="19"/>
+          </w:rPr>
+          <w:t xml:space="preserve">powered by Claude</w:t>
+        </w:r>
+      </w:ins>
+      <w:r>
+        <w:rPr>
+          <w:rFonts w:ascii="Aptos" w:hAnsi="Aptos"/>
+          <w:color w:val="101828"/>
+          <w:sz w:val="19"/>
+        </w:rPr>
+        <w:t xml:space="preserve">, and avoid </w:t>
+      </w:r>
+      <w:del w:id="9055" w:author="Claude" w:date="2026-10-02T00:00:00Z">
+        <w:r>
+          <w:rPr>
+            <w:rFonts w:ascii="Aptos" w:hAnsi="Aptos"/>
+            <w:color w:val="101828"/>
+            <w:sz w:val="19"/>
+          </w:rPr>
+          <w:delText xml:space="preserve">implying that OpenAI</w:delText>
+        </w:r>
+      </w:del>
+      <w:ins w:id="9056" w:author="Claude" w:date="2026-10-02T00:00:00Z">
+        <w:r>
+          <w:rPr>
+            <w:rFonts w:ascii="Aptos" w:hAnsi="Aptos"/>
+            <w:color w:val="101828"/>
+            <w:sz w:val="19"/>
+          </w:rPr>
+          <w:t xml:space="preserve">implying that Anthropic</w:t>
+        </w:r>
+      </w:ins>
+      <w:r>
+        <w:rPr>
+          <w:rFonts w:ascii="Aptos" w:hAnsi="Aptos"/>
+          <w:color w:val="101828"/>
+          <w:sz w:val="19"/>
+        </w:rPr>
+        <w:t xml:space="preserve"> created or endorses the app.</w:t>
       </w:r>
     </w:p>
     <w:tbl>
@@ -13278,7 +13736,62 @@
                 <w:sz w:val="19"/>
               </w:rPr>
               <w:br/>
-              <w:t>No OpenAI branding on the main HangoverBot home screen. If desired, place a small line in Settings → About such as “AI features powered by OpenAI.” This gives transparent credit without making the model provider part of the consumer brand.</w:t>
+            </w:r>
+            <w:del w:id="9057" w:author="Claude" w:date="2026-10-02T00:00:00Z">
+              <w:r>
+                <w:rPr>
+                  <w:rFonts w:ascii="Aptos" w:hAnsi="Aptos"/>
+                  <w:color w:val="101828"/>
+                  <w:sz w:val="19"/>
+                </w:rPr>
+                <w:delText xml:space="preserve">No OpenAI branding</w:delText>
+              </w:r>
+            </w:del>
+            <w:ins w:id="9058" w:author="Claude" w:date="2026-10-02T00:00:00Z">
+              <w:r>
+                <w:rPr>
+                  <w:rFonts w:ascii="Aptos" w:hAnsi="Aptos"/>
+                  <w:color w:val="101828"/>
+                  <w:sz w:val="19"/>
+                </w:rPr>
+                <w:t xml:space="preserve">No Anthropic or Claude branding</w:t>
+              </w:r>
+            </w:ins>
+            <w:r>
+              <w:rPr>
+                <w:rFonts w:ascii="Aptos" w:hAnsi="Aptos"/>
+                <w:color w:val="101828"/>
+                <w:sz w:val="19"/>
+              </w:rPr>
+              <w:t xml:space="preserve"> on the main HangoverBot home screen. If desired, place a small line in Settings → About such as “</w:t>
+            </w:r>
+            <w:del w:id="9059" w:author="Claude" w:date="2026-10-02T00:00:00Z">
+              <w:r>
+                <w:rPr>
+                  <w:rFonts w:ascii="Aptos" w:hAnsi="Aptos"/>
+                  <w:color w:val="101828"/>
+                  <w:sz w:val="19"/>
+                </w:rPr>
+                <w:delText xml:space="preserve">AI features powered by OpenAI.</w:delText>
+              </w:r>
+            </w:del>
+            <w:ins w:id="9060" w:author="Claude" w:date="2026-10-02T00:00:00Z">
+              <w:r>
+                <w:rPr>
+                  <w:rFonts w:ascii="Aptos" w:hAnsi="Aptos"/>
+                  <w:color w:val="101828"/>
+                  <w:sz w:val="19"/>
+                </w:rPr>
+                <w:t xml:space="preserve">AI features powered by Claude.</w:t>
+              </w:r>
+            </w:ins>
+            <w:r>
+              <w:rPr>
+                <w:rFonts w:ascii="Aptos" w:hAnsi="Aptos"/>
+                <w:color w:val="101828"/>
+                <w:sz w:val="19"/>
+              </w:rPr>
+              <w:t xml:space="preserve">” This gives transparent credit without making the model provider part of the consumer brand.</w:t>
             </w:r>
           </w:p>
         </w:tc>
@@ -13293,13 +13806,33 @@
       <w:pPr>
         <w:spacing w:after="100" w:line="254" w:lineRule="auto"/>
       </w:pPr>
+      <w:del w:id="9061" w:author="Claude" w:date="2026-10-02T00:00:00Z">
+        <w:r>
+          <w:rPr>
+            <w:rFonts w:ascii="Aptos" w:hAnsi="Aptos"/>
+            <w:color w:val="101828"/>
+            <w:sz w:val="19"/>
+          </w:rPr>
+          <w:delText xml:space="preserve">Do not put OpenAI, ChatGPT, GPT, or a model name</w:delText>
+        </w:r>
+      </w:del>
+      <w:ins w:id="9062" w:author="Claude" w:date="2026-10-02T00:00:00Z">
+        <w:r>
+          <w:rPr>
+            <w:rFonts w:ascii="Aptos" w:hAnsi="Aptos"/>
+            <w:color w:val="101828"/>
+            <w:sz w:val="19"/>
+          </w:rPr>
+          <w:t xml:space="preserve">Do not put Anthropic, Claude, or a model name</w:t>
+        </w:r>
+      </w:ins>
       <w:r>
         <w:rPr>
           <w:rFonts w:ascii="Aptos" w:hAnsi="Aptos"/>
           <w:color w:val="101828"/>
           <w:sz w:val="19"/>
         </w:rPr>
-        <w:t>Do not put OpenAI, ChatGPT, GPT, or a model name into the app/product/company name. If a specific model is mentioned in technical documentation, keep it accurate and updateable because routing may change.</w:t>
+        <w:t xml:space="preserve"> into the app/product/company name. If a specific model is mentioned in technical documentation, keep it accurate and updateable because routing may change.</w:t>
       </w:r>
     </w:p>
     <w:p>
@@ -13316,14 +13849,26 @@
         <w:t xml:space="preserve">Reference: </w:t>
       </w:r>
       <w:hyperlink r:id="rId12">
+        <w:del w:id="9063" w:author="Claude" w:date="2026-10-02T00:00:00Z">
+          <w:r>
+            <w:rPr>
+              <w:color w:val="2962F3"/>
+              <w:u w:val="single"/>
+            </w:rPr>
+            <w:delText xml:space="preserve">OpenAI Design Guidelines</w:delText>
+          </w:r>
+        </w:del>
+      </w:hyperlink>
+      <w:ins w:id="9064" w:author="Claude" w:date="2026-10-02T00:00:00Z">
         <w:r>
           <w:rPr>
-            <w:color w:val="2962F3"/>
-            <w:u w:val="single"/>
+            <w:rFonts w:ascii="Aptos" w:hAnsi="Aptos"/>
+            <w:color w:val="667085"/>
+            <w:sz w:val="17"/>
           </w:rPr>
-          <w:t>OpenAI Design Guidelines</w:t>
+          <w:t xml:space="preserve">Anthropic's brand and trademark guidelines (confirm the current page on anthropic.com before launch)</w:t>
         </w:r>
-      </w:hyperlink>
+      </w:ins>
     </w:p>
     <w:p>
       <w:pPr>
@@ -15199,11 +15744,27 @@
         <w:pStyle w:val="ListBullet"/>
         <w:spacing w:after="60"/>
       </w:pPr>
+      <w:del w:id="9065" w:author="Claude" w:date="2026-10-02T00:00:00Z">
+        <w:r>
+          <w:rPr>
+            <w:rFonts w:ascii="Aptos" w:hAnsi="Aptos"/>
+          </w:rPr>
+          <w:delText xml:space="preserve">Whether Astra exists</w:delText>
+        </w:r>
+      </w:del>
+      <w:ins w:id="9066" w:author="Claude" w:date="2026-10-02T00:00:00Z">
+        <w:r>
+          <w:rPr>
+            <w:rFonts w:ascii="Aptos" w:hAnsi="Aptos"/>
+          </w:rPr>
+          <w:t xml:space="preserve">Whether Claude Opus 5.5 exists</w:t>
+        </w:r>
+      </w:ins>
       <w:r>
         <w:rPr>
           <w:rFonts w:ascii="Aptos" w:hAnsi="Aptos"/>
         </w:rPr>
-        <w:t>Whether Astra exists in production routing or only benchmark/admin escalation.</w:t>
+        <w:t xml:space="preserve"> in production routing or only benchmark/admin escalation.</w:t>
       </w:r>
     </w:p>
     <w:p>
@@ -15227,7 +15788,29 @@
         <w:rPr>
           <w:rFonts w:ascii="Aptos" w:hAnsi="Aptos"/>
         </w:rPr>
-        <w:t>Whether to show a small “AI features powered by OpenAI” credit in Settings → About.</w:t>
+        <w:t xml:space="preserve">Whether to show a small “AI features </w:t>
+      </w:r>
+      <w:del w:id="9067" w:author="Claude" w:date="2026-10-02T00:00:00Z">
+        <w:r>
+          <w:rPr>
+            <w:rFonts w:ascii="Aptos" w:hAnsi="Aptos"/>
+          </w:rPr>
+          <w:delText xml:space="preserve">powered by OpenAI</w:delText>
+        </w:r>
+      </w:del>
+      <w:ins w:id="9068" w:author="Claude" w:date="2026-10-02T00:00:00Z">
+        <w:r>
+          <w:rPr>
+            <w:rFonts w:ascii="Aptos" w:hAnsi="Aptos"/>
+          </w:rPr>
+          <w:t xml:space="preserve">powered by Claude</w:t>
+        </w:r>
+      </w:ins>
+      <w:r>
+        <w:rPr>
+          <w:rFonts w:ascii="Aptos" w:hAnsi="Aptos"/>
+        </w:rPr>
+        <w:t xml:space="preserve">” credit in Settings → About.</w:t>
       </w:r>
     </w:p>
     <w:p>
@@ -15669,7 +16252,38 @@
                 <w:color w:val="101828"/>
                 <w:sz w:val="17"/>
               </w:rPr>
-              <w:t>Run controlled scenarios against Luna/Sol/Astra; measure quality, tokens, latency, and cost.</w:t>
+              <w:t xml:space="preserve">Run controlled scenarios against </w:t>
+            </w:r>
+            <w:del w:id="9069" w:author="Claude" w:date="2026-10-02T00:00:00Z">
+              <w:r>
+                <w:rPr>
+                  <w:rFonts w:ascii="Aptos" w:hAnsi="Aptos"/>
+                  <w:b w:val="0"/>
+                  <w:color w:val="101828"/>
+                  <w:sz w:val="17"/>
+                </w:rPr>
+                <w:delText xml:space="preserve">Luna/Sol/Astra</w:delText>
+              </w:r>
+            </w:del>
+            <w:ins w:id="9070" w:author="Claude" w:date="2026-10-02T00:00:00Z">
+              <w:r>
+                <w:rPr>
+                  <w:rFonts w:ascii="Aptos" w:hAnsi="Aptos"/>
+                  <w:b w:val="0"/>
+                  <w:color w:val="101828"/>
+                  <w:sz w:val="17"/>
+                </w:rPr>
+                <w:t xml:space="preserve">Claude Haiku 4.5 / Sonnet 5.5 / Opus 5.5 and a single model at low effort</w:t>
+              </w:r>
+            </w:ins>
+            <w:r>
+              <w:rPr>
+                <w:rFonts w:ascii="Aptos" w:hAnsi="Aptos"/>
+                <w:b w:val="0"/>
+                <w:color w:val="101828"/>
+                <w:sz w:val="17"/>
+              </w:rPr>
+              <w:t xml:space="preserve">; measure quality, tokens, latency, and cost.</w:t>
             </w:r>
           </w:p>
         </w:tc>
@@ -16141,7 +16755,38 @@
           <w:color w:val="070A24"/>
           <w:sz w:val="34"/>
         </w:rPr>
-        <w:t>B. Current OpenAI references used in this handoff</w:t>
+        <w:t xml:space="preserve">B. </w:t>
+      </w:r>
+      <w:del w:id="9071" w:author="Claude" w:date="2026-10-02T00:00:00Z">
+        <w:r>
+          <w:rPr>
+            <w:rFonts w:ascii="Aptos" w:hAnsi="Aptos"/>
+            <w:b/>
+            <w:color w:val="070A24"/>
+            <w:sz w:val="34"/>
+          </w:rPr>
+          <w:delText xml:space="preserve">Current OpenAI references</w:delText>
+        </w:r>
+      </w:del>
+      <w:ins w:id="9072" w:author="Claude" w:date="2026-10-02T00:00:00Z">
+        <w:r>
+          <w:rPr>
+            <w:rFonts w:ascii="Aptos" w:hAnsi="Aptos"/>
+            <w:b/>
+            <w:color w:val="070A24"/>
+            <w:sz w:val="34"/>
+          </w:rPr>
+          <w:t xml:space="preserve">Current Anthropic references</w:t>
+        </w:r>
+      </w:ins>
+      <w:r>
+        <w:rPr>
+          <w:rFonts w:ascii="Aptos" w:hAnsi="Aptos"/>
+          <w:b/>
+          <w:color w:val="070A24"/>
+          <w:sz w:val="34"/>
+        </w:rPr>
+        <w:t xml:space="preserve"> used in this handoff</w:t>
       </w:r>
     </w:p>
     <w:tbl>
@@ -16184,69 +16829,147 @@
       <w:pPr>
         <w:spacing w:after="60"/>
       </w:pPr>
-      <w:r>
-        <w:rPr>
-          <w:rFonts w:ascii="Aptos" w:hAnsi="Aptos"/>
-          <w:b/>
-          <w:color w:val="101828"/>
-          <w:sz w:val="18"/>
-        </w:rPr>
-        <w:t xml:space="preserve">OpenAI Design Guidelines: </w:t>
-      </w:r>
-      <w:hyperlink r:id="rId12">
+      <w:del w:id="9073" w:author="Claude" w:date="2026-10-02T00:00:00Z">
         <w:r>
           <w:rPr>
-            <w:color w:val="2962F3"/>
-            <w:u w:val="single"/>
+            <w:rFonts w:ascii="Aptos" w:hAnsi="Aptos"/>
+            <w:b/>
+            <w:color w:val="101828"/>
+            <w:sz w:val="18"/>
           </w:rPr>
-          <w:t>https://openai.com/brand/</w:t>
+          <w:delText xml:space="preserve">OpenAI Design Guidelines: </w:delText>
         </w:r>
+      </w:del>
+      <w:ins w:id="9074" w:author="Claude" w:date="2026-10-02T00:00:00Z">
+        <w:r>
+          <w:rPr>
+            <w:rFonts w:ascii="Aptos" w:hAnsi="Aptos"/>
+            <w:b/>
+            <w:color w:val="101828"/>
+            <w:sz w:val="18"/>
+          </w:rPr>
+          <w:t xml:space="preserve">Claude models overview: </w:t>
+        </w:r>
+      </w:ins>
+      <w:hyperlink r:id="rId12">
+        <w:del w:id="9075" w:author="Claude" w:date="2026-10-02T00:00:00Z">
+          <w:r>
+            <w:rPr>
+              <w:color w:val="2962F3"/>
+              <w:u w:val="single"/>
+            </w:rPr>
+            <w:delText xml:space="preserve">https://openai.com/brand/</w:delText>
+          </w:r>
+        </w:del>
+      </w:hyperlink>
+      <w:hyperlink r:id="rId90">
+        <w:ins w:id="9076" w:author="Claude" w:date="2026-10-02T00:00:00Z">
+          <w:r>
+            <w:rPr>
+              <w:color w:val="2962F3"/>
+              <w:u w:val="single"/>
+            </w:rPr>
+            <w:t xml:space="preserve">https://platform.claude.com/docs/en/about-claude/models/overview</w:t>
+          </w:r>
+        </w:ins>
       </w:hyperlink>
     </w:p>
     <w:p>
       <w:pPr>
         <w:spacing w:after="60"/>
       </w:pPr>
-      <w:r>
-        <w:rPr>
-          <w:rFonts w:ascii="Aptos" w:hAnsi="Aptos"/>
-          <w:b/>
-          <w:color w:val="101828"/>
-          <w:sz w:val="18"/>
-        </w:rPr>
-        <w:t xml:space="preserve">OpenAI API Pricing: </w:t>
-      </w:r>
-      <w:hyperlink r:id="rId14">
+      <w:del w:id="9077" w:author="Claude" w:date="2026-10-02T00:00:00Z">
         <w:r>
           <w:rPr>
-            <w:color w:val="2962F3"/>
-            <w:u w:val="single"/>
+            <w:rFonts w:ascii="Aptos" w:hAnsi="Aptos"/>
+            <w:b/>
+            <w:color w:val="101828"/>
+            <w:sz w:val="18"/>
           </w:rPr>
-          <w:t>https://developers.openai.com/api/docs/pricing</w:t>
+          <w:delText xml:space="preserve">OpenAI API Pricing: </w:delText>
         </w:r>
+      </w:del>
+      <w:ins w:id="9078" w:author="Claude" w:date="2026-10-02T00:00:00Z">
+        <w:r>
+          <w:rPr>
+            <w:rFonts w:ascii="Aptos" w:hAnsi="Aptos"/>
+            <w:b/>
+            <w:color w:val="101828"/>
+            <w:sz w:val="18"/>
+          </w:rPr>
+          <w:t xml:space="preserve">Claude API pricing: </w:t>
+        </w:r>
+      </w:ins>
+      <w:hyperlink r:id="rId14">
+        <w:del w:id="9079" w:author="Claude" w:date="2026-10-02T00:00:00Z">
+          <w:r>
+            <w:rPr>
+              <w:color w:val="2962F3"/>
+              <w:u w:val="single"/>
+            </w:rPr>
+            <w:delText xml:space="preserve">https://developers.openai.com/api/docs/pricing</w:delText>
+          </w:r>
+        </w:del>
+      </w:hyperlink>
+      <w:hyperlink r:id="rId91">
+        <w:ins w:id="9080" w:author="Claude" w:date="2026-10-02T00:00:00Z">
+          <w:r>
+            <w:rPr>
+              <w:color w:val="2962F3"/>
+              <w:u w:val="single"/>
+            </w:rPr>
+            <w:t xml:space="preserve">https://platform.claude.com/docs/en/about-claude/pricing</w:t>
+          </w:r>
+        </w:ins>
       </w:hyperlink>
     </w:p>
     <w:p>
       <w:pPr>
         <w:spacing w:after="60"/>
       </w:pPr>
-      <w:r>
-        <w:rPr>
-          <w:rFonts w:ascii="Aptos" w:hAnsi="Aptos"/>
-          <w:b/>
-          <w:color w:val="101828"/>
-          <w:sz w:val="18"/>
-        </w:rPr>
-        <w:t xml:space="preserve">OpenAI Models: </w:t>
-      </w:r>
-      <w:hyperlink r:id="rId15">
+      <w:del w:id="9081" w:author="Claude" w:date="2026-10-02T00:00:00Z">
         <w:r>
           <w:rPr>
-            <w:color w:val="2962F3"/>
-            <w:u w:val="single"/>
+            <w:rFonts w:ascii="Aptos" w:hAnsi="Aptos"/>
+            <w:b/>
+            <w:color w:val="101828"/>
+            <w:sz w:val="18"/>
           </w:rPr>
-          <w:t>https://developers.openai.com/api/docs/models</w:t>
+          <w:delText xml:space="preserve">OpenAI Models: </w:delText>
         </w:r>
+      </w:del>
+      <w:ins w:id="9082" w:author="Claude" w:date="2026-10-02T00:00:00Z">
+        <w:r>
+          <w:rPr>
+            <w:rFonts w:ascii="Aptos" w:hAnsi="Aptos"/>
+            <w:b/>
+            <w:color w:val="101828"/>
+            <w:sz w:val="18"/>
+          </w:rPr>
+          <w:t xml:space="preserve">Effort and thinking: </w:t>
+        </w:r>
+      </w:ins>
+      <w:hyperlink r:id="rId15">
+        <w:del w:id="9083" w:author="Claude" w:date="2026-10-02T00:00:00Z">
+          <w:r>
+            <w:rPr>
+              <w:color w:val="2962F3"/>
+              <w:u w:val="single"/>
+            </w:rPr>
+            <w:delText xml:space="preserve">https://developers.openai.com/api/docs/models</w:delText>
+          </w:r>
+        </w:del>
+      </w:hyperlink>
+      <w:hyperlink r:id="rId92">
+        <w:ins w:id="9084" w:author="Claude" w:date="2026-10-02T00:00:00Z">
+          <w:r>
+            <w:rPr>
+              <w:color w:val="2962F3"/>
+              <w:u w:val="single"/>
+            </w:rPr>
+            <w:t xml:space="preserve">https://platform.claude.com/docs/en/build-with-claude/effort</w:t>
+          </w:r>
+        </w:ins>
       </w:hyperlink>
     </w:p>
     <w:p>

</xml_diff>